<commit_message>
PC1: los prompts de la entrega son los usados para construir el producto
El prompt de CU-20 sale de la entrega (queda como borrador para PC2). La
sección 7 del documento y la slide de prompts muestran CLAUDE.md, el prompt
de cada sesión y la skill del proyecto; la carpeta de entrega suma la skill.

Co-Authored-By: Claude Opus 5.5 <noreply@anthropic.com>
</commit_message>
<xml_diff>
--- a/07-Entregables/PC1/Rumbo — PC1.docx
+++ b/07-Entregables/PC1/Rumbo — PC1.docx
@@ -27109,7 +27109,7 @@
     <w:bookmarkEnd w:id="192"/>
     <w:bookmarkEnd w:id="193"/>
     <w:bookmarkEnd w:id="194"/>
-    <w:bookmarkStart w:id="216" w:name="Xcd9e708fb52b998eea603efb3578ff0bb0afc07"/>
+    <w:bookmarkStart w:id="213" w:name="Xcd9e708fb52b998eea603efb3578ff0bb0afc07"/>
     <w:p>
       <w:pPr>
         <w:pStyle w:val="Heading1"/>
@@ -28364,22 +28364,13 @@
     <w:bookmarkEnd w:id="206"/>
     <w:bookmarkEnd w:id="207"/>
     <w:bookmarkEnd w:id="208"/>
-    <w:bookmarkStart w:id="214" w:name="prompt-de-la-ia-del-producto-cu-20"/>
+    <w:bookmarkStart w:id="212" w:name="X159548b9be34913bdc5197db50a8d5ffd5260b2"/>
     <w:p>
       <w:pPr>
         <w:pStyle w:val="Heading2"/>
       </w:pPr>
       <w:r>
-        <w:t xml:space="preserve">Prompt de la IA del producto (CU-20)</w:t>
-      </w:r>
-    </w:p>
-    <w:bookmarkStart w:id="209" w:name="cómo-se-arma-el-pedido"/>
-    <w:p>
-      <w:pPr>
-        <w:pStyle w:val="Heading3"/>
-      </w:pPr>
-      <w:r>
-        <w:t xml:space="preserve">Cómo se arma el pedido</w:t>
+        <w:t xml:space="preserve">Prompts usados para construir el producto</w:t>
       </w:r>
     </w:p>
     <w:p>
@@ -28387,22 +28378,7 @@
         <w:pStyle w:val="FirstParagraph"/>
       </w:pPr>
       <w:r>
-        <w:t xml:space="preserve">El servicio del módulo</w:t>
-      </w:r>
-      <w:r>
-        <w:t xml:space="preserve"> </w:t>
-      </w:r>
-      <w:r>
-        <w:rPr>
-          <w:rStyle w:val="VerbatimChar"/>
-        </w:rPr>
-        <w:t xml:space="preserve">redes</w:t>
-      </w:r>
-      <w:r>
-        <w:t xml:space="preserve"> </w:t>
-      </w:r>
-      <w:r>
-        <w:t xml:space="preserve">arma el pedido con LangChain en dos partes: un</w:t>
+        <w:t xml:space="preserve">El análisis y el diseño de Rumbo se construyeron</w:t>
       </w:r>
       <w:r>
         <w:t xml:space="preserve"> </w:t>
@@ -28412,10 +28388,48 @@
           <w:b/>
           <w:bCs/>
         </w:rPr>
-        <w:t xml:space="preserve">prompt de sistema</w:t>
-      </w:r>
-      <w:r>
-        <w:t xml:space="preserve">, fijo, que define el rol y los límites, y un</w:t>
+        <w:t xml:space="preserve">guiados con IA</w:t>
+      </w:r>
+      <w:r>
+        <w:t xml:space="preserve">: cada integrante trabaja en sesiones con el agente de desarrollo, Claude Code, sobre el repositorio del proyecto. Lo que orienta al agente son tres tipos de prompt, todos escritos por el equipo y versionados en el repositorio.</w:t>
+      </w:r>
+    </w:p>
+    <w:bookmarkStart w:id="209" w:name="X5f513a9e1eb2749ffb99b4abf985a61a10a742a"/>
+    <w:p>
+      <w:pPr>
+        <w:pStyle w:val="Heading3"/>
+      </w:pPr>
+      <w:r>
+        <w:t xml:space="preserve">1. El prompt de sistema del agente:</w:t>
+      </w:r>
+      <w:r>
+        <w:t xml:space="preserve"> </w:t>
+      </w:r>
+      <w:r>
+        <w:rPr>
+          <w:rStyle w:val="VerbatimChar"/>
+        </w:rPr>
+        <w:t xml:space="preserve">CLAUDE.md</w:t>
+      </w:r>
+    </w:p>
+    <w:p>
+      <w:pPr>
+        <w:pStyle w:val="FirstParagraph"/>
+      </w:pPr>
+      <w:r>
+        <w:t xml:space="preserve">Claude Code no recuerda las sesiones anteriores. Lo que le da contexto y reglas en cada sesión es el archivo</w:t>
+      </w:r>
+      <w:r>
+        <w:t xml:space="preserve"> </w:t>
+      </w:r>
+      <w:r>
+        <w:rPr>
+          <w:rStyle w:val="VerbatimChar"/>
+        </w:rPr>
+        <w:t xml:space="preserve">CLAUDE.md</w:t>
+      </w:r>
+      <w:r>
+        <w:t xml:space="preserve">, en la raíz del repositorio: el agente lo lee al empezar y funciona como su</w:t>
       </w:r>
       <w:r>
         <w:t xml:space="preserve"> </w:t>
@@ -28425,570 +28439,25 @@
           <w:b/>
           <w:bCs/>
         </w:rPr>
-        <w:t xml:space="preserve">prompt de usuario</w:t>
-      </w:r>
-      <w:r>
-        <w:t xml:space="preserve">, que se completa con las tres variables que carga el empleado. Se hace</w:t>
-      </w:r>
-      <w:r>
-        <w:t xml:space="preserve"> </w:t>
-      </w:r>
+        <w:t xml:space="preserve">prompt de sistema</w:t>
+      </w:r>
+      <w:r>
+        <w:t xml:space="preserve"> </w:t>
+      </w:r>
+      <w:r>
+        <w:t xml:space="preserve">para este proyecto. El archivo completo va en la carpeta de entrega; estas son sus partes centrales.</w:t>
+      </w:r>
+    </w:p>
+    <w:p>
+      <w:pPr>
+        <w:pStyle w:val="BodyText"/>
+      </w:pPr>
       <w:r>
         <w:rPr>
           <w:b/>
           <w:bCs/>
         </w:rPr>
-        <w:t xml:space="preserve">una sola llamada</w:t>
-      </w:r>
-      <w:r>
-        <w:t xml:space="preserve"> </w:t>
-      </w:r>
-      <w:r>
-        <w:t xml:space="preserve">a Claude Sonnet 5.5 y se devuelve un borrador; si no convence, el empleado ajusta los datos y pide otro (A1).</w:t>
-      </w:r>
-    </w:p>
-    <w:tbl>
-      <w:tblPr>
-        <w:tblStyle w:val="Table"/>
-        <w:tblW w:type="pct" w:w="5000"/>
-        <w:tblLayout w:type="fixed"/>
-        <w:tblLook w:firstRow="1" w:lastRow="0" w:firstColumn="0" w:lastColumn="0" w:noHBand="0" w:noVBand="0" w:val="0020"/>
-      </w:tblPr>
-      <w:tblGrid>
-        <w:gridCol w:w="2640"/>
-        <w:gridCol w:w="2640"/>
-        <w:gridCol w:w="2640"/>
-      </w:tblGrid>
-      <w:tr>
-        <w:trPr>
-          <w:tblHeader w:val="on"/>
-        </w:trPr>
-        <w:tc>
-          <w:tcPr/>
-          <w:p>
-            <w:pPr>
-              <w:pStyle w:val="Compact"/>
-            </w:pPr>
-            <w:r>
-              <w:t xml:space="preserve">Variable</w:t>
-            </w:r>
-          </w:p>
-        </w:tc>
-        <w:tc>
-          <w:tcPr/>
-          <w:p>
-            <w:pPr>
-              <w:pStyle w:val="Compact"/>
-            </w:pPr>
-            <w:r>
-              <w:t xml:space="preserve">Qué es</w:t>
-            </w:r>
-          </w:p>
-        </w:tc>
-        <w:tc>
-          <w:tcPr/>
-          <w:p>
-            <w:pPr>
-              <w:pStyle w:val="Compact"/>
-            </w:pPr>
-            <w:r>
-              <w:t xml:space="preserve">Valores</w:t>
-            </w:r>
-          </w:p>
-        </w:tc>
-      </w:tr>
-      <w:tr>
-        <w:tc>
-          <w:tcPr/>
-          <w:p>
-            <w:pPr>
-              <w:pStyle w:val="Compact"/>
-            </w:pPr>
-            <w:r>
-              <w:rPr>
-                <w:rStyle w:val="VerbatimChar"/>
-              </w:rPr>
-              <w:t xml:space="preserve">tema</w:t>
-            </w:r>
-          </w:p>
-        </w:tc>
-        <w:tc>
-          <w:tcPr/>
-          <w:p>
-            <w:pPr>
-              <w:pStyle w:val="Compact"/>
-            </w:pPr>
-            <w:r>
-              <w:t xml:space="preserve">El destino, la oferta o la idea del posteo</w:t>
-            </w:r>
-          </w:p>
-        </w:tc>
-        <w:tc>
-          <w:tcPr/>
-          <w:p>
-            <w:pPr>
-              <w:pStyle w:val="Compact"/>
-            </w:pPr>
-            <w:r>
-              <w:t xml:space="preserve">Texto libre, obligatorio</w:t>
-            </w:r>
-          </w:p>
-        </w:tc>
-      </w:tr>
-      <w:tr>
-        <w:tc>
-          <w:tcPr/>
-          <w:p>
-            <w:pPr>
-              <w:pStyle w:val="Compact"/>
-            </w:pPr>
-            <w:r>
-              <w:rPr>
-                <w:rStyle w:val="VerbatimChar"/>
-              </w:rPr>
-              <w:t xml:space="preserve">canal</w:t>
-            </w:r>
-          </w:p>
-        </w:tc>
-        <w:tc>
-          <w:tcPr/>
-          <w:p>
-            <w:pPr>
-              <w:pStyle w:val="Compact"/>
-            </w:pPr>
-            <w:r>
-              <w:t xml:space="preserve">Dónde se va a publicar</w:t>
-            </w:r>
-          </w:p>
-        </w:tc>
-        <w:tc>
-          <w:tcPr/>
-          <w:p>
-            <w:pPr>
-              <w:pStyle w:val="Compact"/>
-            </w:pPr>
-            <w:r>
-              <w:rPr>
-                <w:rStyle w:val="VerbatimChar"/>
-              </w:rPr>
-              <w:t xml:space="preserve">instagram</w:t>
-            </w:r>
-            <w:r>
-              <w:t xml:space="preserve">,</w:t>
-            </w:r>
-            <w:r>
-              <w:t xml:space="preserve"> </w:t>
-            </w:r>
-            <w:r>
-              <w:rPr>
-                <w:rStyle w:val="VerbatimChar"/>
-              </w:rPr>
-              <w:t xml:space="preserve">tiktok</w:t>
-            </w:r>
-            <w:r>
-              <w:t xml:space="preserve"> </w:t>
-            </w:r>
-            <w:r>
-              <w:t xml:space="preserve">o</w:t>
-            </w:r>
-            <w:r>
-              <w:t xml:space="preserve"> </w:t>
-            </w:r>
-            <w:r>
-              <w:rPr>
-                <w:rStyle w:val="VerbatimChar"/>
-              </w:rPr>
-              <w:t xml:space="preserve">whatsapp_ventas</w:t>
-            </w:r>
-            <w:r>
-              <w:t xml:space="preserve"> </w:t>
-            </w:r>
-            <w:r>
-              <w:t xml:space="preserve">(los canales de ContenidoRed)</w:t>
-            </w:r>
-          </w:p>
-        </w:tc>
-      </w:tr>
-      <w:tr>
-        <w:tc>
-          <w:tcPr/>
-          <w:p>
-            <w:pPr>
-              <w:pStyle w:val="Compact"/>
-            </w:pPr>
-            <w:r>
-              <w:rPr>
-                <w:rStyle w:val="VerbatimChar"/>
-              </w:rPr>
-              <w:t xml:space="preserve">tono</w:t>
-            </w:r>
-          </w:p>
-        </w:tc>
-        <w:tc>
-          <w:tcPr/>
-          <w:p>
-            <w:pPr>
-              <w:pStyle w:val="Compact"/>
-            </w:pPr>
-            <w:r>
-              <w:t xml:space="preserve">El objetivo del posteo</w:t>
-            </w:r>
-          </w:p>
-        </w:tc>
-        <w:tc>
-          <w:tcPr/>
-          <w:p>
-            <w:pPr>
-              <w:pStyle w:val="Compact"/>
-            </w:pPr>
-            <w:r>
-              <w:t xml:space="preserve">Texto libre, por ejemplo «promocionar un destino» o «anunciar una oferta»</w:t>
-            </w:r>
-          </w:p>
-        </w:tc>
-      </w:tr>
-    </w:tbl>
-    <w:bookmarkEnd w:id="209"/>
-    <w:bookmarkStart w:id="210" w:name="prompt-de-sistema"/>
-    <w:p>
-      <w:pPr>
-        <w:pStyle w:val="Heading3"/>
-      </w:pPr>
-      <w:r>
-        <w:t xml:space="preserve">Prompt de sistema</w:t>
-      </w:r>
-    </w:p>
-    <w:p>
-      <w:pPr>
-        <w:pStyle w:val="SourceCode"/>
-      </w:pPr>
-      <w:r>
-        <w:rPr>
-          <w:rStyle w:val="VerbatimChar"/>
-        </w:rPr>
-        <w:t xml:space="preserve">Sos redactor de contenido para redes sociales de una agencia de turismo argentina.</w:t>
-      </w:r>
-      <w:r>
-        <w:br/>
-      </w:r>
-      <w:r>
-        <w:rPr>
-          <w:rStyle w:val="VerbatimChar"/>
-        </w:rPr>
-        <w:t xml:space="preserve">Escribís en español de Argentina, con voseo, de forma cálida y clara.</w:t>
-      </w:r>
-      <w:r>
-        <w:br/>
-      </w:r>
-      <w:r>
-        <w:br/>
-      </w:r>
-      <w:r>
-        <w:rPr>
-          <w:rStyle w:val="VerbatimChar"/>
-        </w:rPr>
-        <w:t xml:space="preserve">Tu tarea es proponer UN borrador de posteo a partir del tema, el canal y el tono</w:t>
-      </w:r>
-      <w:r>
-        <w:br/>
-      </w:r>
-      <w:r>
-        <w:rPr>
-          <w:rStyle w:val="VerbatimChar"/>
-        </w:rPr>
-        <w:t xml:space="preserve">que te indica una persona de la agencia. Esa persona lo va a revisar, corregir y</w:t>
-      </w:r>
-      <w:r>
-        <w:br/>
-      </w:r>
-      <w:r>
-        <w:rPr>
-          <w:rStyle w:val="VerbatimChar"/>
-        </w:rPr>
-        <w:t xml:space="preserve">publicar a mano: vos no publicás nada.</w:t>
-      </w:r>
-      <w:r>
-        <w:br/>
-      </w:r>
-      <w:r>
-        <w:br/>
-      </w:r>
-      <w:r>
-        <w:rPr>
-          <w:rStyle w:val="VerbatimChar"/>
-        </w:rPr>
-        <w:t xml:space="preserve">Reglas:</w:t>
-      </w:r>
-      <w:r>
-        <w:br/>
-      </w:r>
-      <w:r>
-        <w:rPr>
-          <w:rStyle w:val="VerbatimChar"/>
-        </w:rPr>
-        <w:t xml:space="preserve">- Usá solo la información del pedido. No inventes precios, fechas, cupos, nombres</w:t>
-      </w:r>
-      <w:r>
-        <w:br/>
-      </w:r>
-      <w:r>
-        <w:rPr>
-          <w:rStyle w:val="VerbatimChar"/>
-        </w:rPr>
-        <w:t xml:space="preserve">  de hoteles ni promociones que no estén en el tema.</w:t>
-      </w:r>
-      <w:r>
-        <w:br/>
-      </w:r>
-      <w:r>
-        <w:rPr>
-          <w:rStyle w:val="VerbatimChar"/>
-        </w:rPr>
-        <w:t xml:space="preserve">- Si el tema no alcanza para un dato concreto, dejá un marcador entre corchetes,</w:t>
-      </w:r>
-      <w:r>
-        <w:br/>
-      </w:r>
-      <w:r>
-        <w:rPr>
-          <w:rStyle w:val="VerbatimChar"/>
-        </w:rPr>
-        <w:t xml:space="preserve">  por ejemplo [precio] o [fecha de salida], para que la persona lo complete.</w:t>
-      </w:r>
-      <w:r>
-        <w:br/>
-      </w:r>
-      <w:r>
-        <w:rPr>
-          <w:rStyle w:val="VerbatimChar"/>
-        </w:rPr>
-        <w:t xml:space="preserve">- No incluyas datos personales de clientes.</w:t>
-      </w:r>
-      <w:r>
-        <w:br/>
-      </w:r>
-      <w:r>
-        <w:rPr>
-          <w:rStyle w:val="VerbatimChar"/>
-        </w:rPr>
-        <w:t xml:space="preserve">- Adaptá el largo y el formato al canal:</w:t>
-      </w:r>
-      <w:r>
-        <w:br/>
-      </w:r>
-      <w:r>
-        <w:rPr>
-          <w:rStyle w:val="VerbatimChar"/>
-        </w:rPr>
-        <w:t xml:space="preserve">  - instagram: hasta 120 palabras, un párrafo de gancho, una llamada a la acción</w:t>
-      </w:r>
-      <w:r>
-        <w:br/>
-      </w:r>
-      <w:r>
-        <w:rPr>
-          <w:rStyle w:val="VerbatimChar"/>
-        </w:rPr>
-        <w:t xml:space="preserve">    y entre 3 y 6 hashtags al final.</w:t>
-      </w:r>
-      <w:r>
-        <w:br/>
-      </w:r>
-      <w:r>
-        <w:rPr>
-          <w:rStyle w:val="VerbatimChar"/>
-        </w:rPr>
-        <w:t xml:space="preserve">  - tiktok: un guion corto para un video de 15 a 30 segundos, con las escenas en</w:t>
-      </w:r>
-      <w:r>
-        <w:br/>
-      </w:r>
-      <w:r>
-        <w:rPr>
-          <w:rStyle w:val="VerbatimChar"/>
-        </w:rPr>
-        <w:t xml:space="preserve">    viñetas, y una línea de texto para la descripción.</w:t>
-      </w:r>
-      <w:r>
-        <w:br/>
-      </w:r>
-      <w:r>
-        <w:rPr>
-          <w:rStyle w:val="VerbatimChar"/>
-        </w:rPr>
-        <w:t xml:space="preserve">  - whatsapp_ventas: un mensaje de difusión de hasta 60 palabras, sin hashtags,</w:t>
-      </w:r>
-      <w:r>
-        <w:br/>
-      </w:r>
-      <w:r>
-        <w:rPr>
-          <w:rStyle w:val="VerbatimChar"/>
-        </w:rPr>
-        <w:t xml:space="preserve">    con una pregunta final que invite a responder.</w:t>
-      </w:r>
-      <w:r>
-        <w:br/>
-      </w:r>
-      <w:r>
-        <w:rPr>
-          <w:rStyle w:val="VerbatimChar"/>
-        </w:rPr>
-        <w:t xml:space="preserve">- Respondé solo con el borrador, sin explicaciones ni comentarios.</w:t>
-      </w:r>
-    </w:p>
-    <w:bookmarkEnd w:id="210"/>
-    <w:bookmarkStart w:id="211" w:name="prompt-de-usuario-plantilla"/>
-    <w:p>
-      <w:pPr>
-        <w:pStyle w:val="Heading3"/>
-      </w:pPr>
-      <w:r>
-        <w:t xml:space="preserve">Prompt de usuario (plantilla)</w:t>
-      </w:r>
-    </w:p>
-    <w:p>
-      <w:pPr>
-        <w:pStyle w:val="SourceCode"/>
-      </w:pPr>
-      <w:r>
-        <w:rPr>
-          <w:rStyle w:val="VerbatimChar"/>
-        </w:rPr>
-        <w:t xml:space="preserve">Tema: {tema}</w:t>
-      </w:r>
-      <w:r>
-        <w:br/>
-      </w:r>
-      <w:r>
-        <w:rPr>
-          <w:rStyle w:val="VerbatimChar"/>
-        </w:rPr>
-        <w:t xml:space="preserve">Canal: {canal}</w:t>
-      </w:r>
-      <w:r>
-        <w:br/>
-      </w:r>
-      <w:r>
-        <w:rPr>
-          <w:rStyle w:val="VerbatimChar"/>
-        </w:rPr>
-        <w:t xml:space="preserve">Tono u objetivo: {tono}</w:t>
-      </w:r>
-    </w:p>
-    <w:bookmarkEnd w:id="211"/>
-    <w:bookmarkStart w:id="212" w:name="ejemplo"/>
-    <w:p>
-      <w:pPr>
-        <w:pStyle w:val="Heading3"/>
-      </w:pPr>
-      <w:r>
-        <w:t xml:space="preserve">Ejemplo</w:t>
-      </w:r>
-    </w:p>
-    <w:p>
-      <w:pPr>
-        <w:pStyle w:val="FirstParagraph"/>
-      </w:pPr>
-      <w:r>
-        <w:t xml:space="preserve">Datos que carga el empleado:</w:t>
-      </w:r>
-    </w:p>
-    <w:p>
-      <w:pPr>
-        <w:pStyle w:val="SourceCode"/>
-      </w:pPr>
-      <w:r>
-        <w:rPr>
-          <w:rStyle w:val="VerbatimChar"/>
-        </w:rPr>
-        <w:t xml:space="preserve">Tema: Cataratas del Iguazú en 4 días, salida grupal en noviembre</w:t>
-      </w:r>
-      <w:r>
-        <w:br/>
-      </w:r>
-      <w:r>
-        <w:rPr>
-          <w:rStyle w:val="VerbatimChar"/>
-        </w:rPr>
-        <w:t xml:space="preserve">Canal: instagram</w:t>
-      </w:r>
-      <w:r>
-        <w:br/>
-      </w:r>
-      <w:r>
-        <w:rPr>
-          <w:rStyle w:val="VerbatimChar"/>
-        </w:rPr>
-        <w:t xml:space="preserve">Tono u objetivo: promocionar un destino</w:t>
-      </w:r>
-    </w:p>
-    <w:p>
-      <w:pPr>
-        <w:pStyle w:val="FirstParagraph"/>
-      </w:pPr>
-      <w:r>
-        <w:t xml:space="preserve">Borrador que podría devolver el modelo (ilustrativo, no es una salida real):</w:t>
-      </w:r>
-    </w:p>
-    <w:p>
-      <w:pPr>
-        <w:pStyle w:val="SourceCode"/>
-      </w:pPr>
-      <w:r>
-        <w:rPr>
-          <w:rStyle w:val="VerbatimChar"/>
-        </w:rPr>
-        <w:t xml:space="preserve">¿Te imaginás sentir la fuerza de la Garganta del Diablo a pocos metros?</w:t>
-      </w:r>
-      <w:r>
-        <w:br/>
-      </w:r>
-      <w:r>
-        <w:rPr>
-          <w:rStyle w:val="VerbatimChar"/>
-        </w:rPr>
-        <w:t xml:space="preserve">Te proponemos 4 días en las Cataratas del Iguazú, con salida grupal en noviembre:</w:t>
-      </w:r>
-      <w:r>
-        <w:br/>
-      </w:r>
-      <w:r>
-        <w:rPr>
-          <w:rStyle w:val="VerbatimChar"/>
-        </w:rPr>
-        <w:t xml:space="preserve">senderos, lancha bajo los saltos y noches tranquilas en la selva misionera.</w:t>
-      </w:r>
-      <w:r>
-        <w:br/>
-      </w:r>
-      <w:r>
-        <w:rPr>
-          <w:rStyle w:val="VerbatimChar"/>
-        </w:rPr>
-        <w:t xml:space="preserve">Cupos limitados. Escribinos y armamos tu lugar en el grupo. Desde [precio].</w:t>
-      </w:r>
-      <w:r>
-        <w:br/>
-      </w:r>
-      <w:r>
-        <w:br/>
-      </w:r>
-      <w:r>
-        <w:rPr>
-          <w:rStyle w:val="VerbatimChar"/>
-        </w:rPr>
-        <w:t xml:space="preserve">#CataratasDelIguazú #ViajarEnGrupo #Misiones #EscapadaArgentina</w:t>
-      </w:r>
-    </w:p>
-    <w:bookmarkEnd w:id="212"/>
-    <w:bookmarkStart w:id="213" w:name="por-qué-así"/>
-    <w:p>
-      <w:pPr>
-        <w:pStyle w:val="Heading3"/>
-      </w:pPr>
-      <w:r>
-        <w:t xml:space="preserve">Por qué así</w:t>
+        <w:t xml:space="preserve">Cómo entra en contexto al iniciar cada sesión:</w:t>
       </w:r>
     </w:p>
     <w:p>
@@ -29000,17 +28469,7 @@
         </w:numPr>
       </w:pPr>
       <w:r>
-        <w:rPr>
-          <w:b/>
-          <w:bCs/>
-        </w:rPr>
-        <w:t xml:space="preserve">Límites en el prompt de sistema:</w:t>
-      </w:r>
-      <w:r>
-        <w:t xml:space="preserve"> </w:t>
-      </w:r>
-      <w:r>
-        <w:t xml:space="preserve">son los de CU-20 y de la decisión sobre el modelo (no publica, no usa datos del negocio). Se suma no inventar datos comerciales, porque un precio o una fecha inventados en un posteo le generan un problema real a la agencia.</w:t>
+        <w:t xml:space="preserve">Identifica a la persona por su usuario de Git y le avisa si tiene tareas pendientes.</w:t>
       </w:r>
     </w:p>
     <w:p>
@@ -29022,17 +28481,7 @@
         </w:numPr>
       </w:pPr>
       <w:r>
-        <w:rPr>
-          <w:b/>
-          <w:bCs/>
-        </w:rPr>
-        <w:t xml:space="preserve">Marcadores entre corchetes:</w:t>
-      </w:r>
-      <w:r>
-        <w:t xml:space="preserve"> </w:t>
-      </w:r>
-      <w:r>
-        <w:t xml:space="preserve">hacen visible lo que la persona tiene que completar antes de publicar.</w:t>
+        <w:t xml:space="preserve">Revisa el estado del repositorio y trae la última versión del trabajo del equipo.</w:t>
       </w:r>
     </w:p>
     <w:p>
@@ -29044,17 +28493,7 @@
         </w:numPr>
       </w:pPr>
       <w:r>
-        <w:rPr>
-          <w:b/>
-          <w:bCs/>
-        </w:rPr>
-        <w:t xml:space="preserve">Formato por canal:</w:t>
-      </w:r>
-      <w:r>
-        <w:t xml:space="preserve"> </w:t>
-      </w:r>
-      <w:r>
-        <w:t xml:space="preserve">los tres canales de ContenidoRed piden textos distintos, y dejarlo en el prompt evita que el empleado tenga que explicarlo en cada pedido.</w:t>
+        <w:t xml:space="preserve">Lee el estado del proyecto, la bitácora de sesiones y la memoria del proyecto.</w:t>
       </w:r>
     </w:p>
     <w:p>
@@ -29066,76 +28505,31 @@
         </w:numPr>
       </w:pPr>
       <w:r>
+        <w:t xml:space="preserve">Comprueba que estén disponibles las skills compartidas del equipo.</w:t>
+      </w:r>
+    </w:p>
+    <w:p>
+      <w:pPr>
+        <w:pStyle w:val="Compact"/>
+        <w:numPr>
+          <w:ilvl w:val="0"/>
+          <w:numId w:val="1030"/>
+        </w:numPr>
+      </w:pPr>
+      <w:r>
+        <w:t xml:space="preserve">Abre solo las notas relacionadas con la tarea, entrando por su índice, y consulta las decisiones relacionadas antes de proponer un cambio.</w:t>
+      </w:r>
+    </w:p>
+    <w:p>
+      <w:pPr>
+        <w:pStyle w:val="FirstParagraph"/>
+      </w:pPr>
+      <w:r>
         <w:rPr>
           <w:b/>
           <w:bCs/>
         </w:rPr>
-        <w:t xml:space="preserve">Sin parámetros explícitos:</w:t>
-      </w:r>
-      <w:r>
-        <w:t xml:space="preserve"> </w:t>
-      </w:r>
-      <w:r>
-        <w:t xml:space="preserve">se usan los valores por defecto del modelo, como se decidió al elegirlo.</w:t>
-      </w:r>
-    </w:p>
-    <w:bookmarkEnd w:id="213"/>
-    <w:bookmarkEnd w:id="214"/>
-    <w:bookmarkStart w:id="215" w:name="prompts-del-agente-de-desarrollo"/>
-    <w:p>
-      <w:pPr>
-        <w:pStyle w:val="Heading2"/>
-      </w:pPr>
-      <w:r>
-        <w:t xml:space="preserve">Prompts del agente de desarrollo</w:t>
-      </w:r>
-    </w:p>
-    <w:p>
-      <w:pPr>
-        <w:pStyle w:val="FirstParagraph"/>
-      </w:pPr>
-      <w:r>
-        <w:t xml:space="preserve">Claude Code no recuerda las sesiones anteriores. Lo que le da contexto y reglas en cada sesión es el archivo</w:t>
-      </w:r>
-      <w:r>
-        <w:t xml:space="preserve"> </w:t>
-      </w:r>
-      <w:r>
-        <w:rPr>
-          <w:rStyle w:val="VerbatimChar"/>
-        </w:rPr>
-        <w:t xml:space="preserve">CLAUDE.md</w:t>
-      </w:r>
-      <w:r>
-        <w:t xml:space="preserve">, en la raíz del repositorio: Claude Code lo lee al empezar y funciona como su</w:t>
-      </w:r>
-      <w:r>
-        <w:t xml:space="preserve"> </w:t>
-      </w:r>
-      <w:r>
-        <w:rPr>
-          <w:b/>
-          <w:bCs/>
-        </w:rPr>
-        <w:t xml:space="preserve">prompt de sistema</w:t>
-      </w:r>
-      <w:r>
-        <w:t xml:space="preserve"> </w:t>
-      </w:r>
-      <w:r>
-        <w:t xml:space="preserve">para este proyecto. El archivo completo va en la carpeta de entrega; estas son sus partes centrales.</w:t>
-      </w:r>
-    </w:p>
-    <w:p>
-      <w:pPr>
-        <w:pStyle w:val="BodyText"/>
-      </w:pPr>
-      <w:r>
-        <w:rPr>
-          <w:b/>
-          <w:bCs/>
-        </w:rPr>
-        <w:t xml:space="preserve">Cómo entra en contexto al iniciar cada sesión:</w:t>
+        <w:t xml:space="preserve">Reglas de trabajo durante la sesión:</w:t>
       </w:r>
     </w:p>
     <w:p>
@@ -29147,7 +28541,88 @@
         </w:numPr>
       </w:pPr>
       <w:r>
-        <w:t xml:space="preserve">Identifica a la persona por su usuario de Git y le avisa si tiene tareas pendientes.</w:t>
+        <w:t xml:space="preserve">Escribir en español de Argentina, con importes en ARS y fechas</w:t>
+      </w:r>
+      <w:r>
+        <w:t xml:space="preserve"> </w:t>
+      </w:r>
+      <w:r>
+        <w:rPr>
+          <w:rStyle w:val="VerbatimChar"/>
+        </w:rPr>
+        <w:t xml:space="preserve">dd/mm/aa</w:t>
+      </w:r>
+      <w:r>
+        <w:t xml:space="preserve">, y respetar los nombres del lenguaje del negocio (</w:t>
+      </w:r>
+      <w:r>
+        <w:rPr>
+          <w:rStyle w:val="VerbatimChar"/>
+        </w:rPr>
+        <w:t xml:space="preserve">Cliente</w:t>
+      </w:r>
+      <w:r>
+        <w:t xml:space="preserve">,</w:t>
+      </w:r>
+      <w:r>
+        <w:t xml:space="preserve"> </w:t>
+      </w:r>
+      <w:r>
+        <w:rPr>
+          <w:rStyle w:val="VerbatimChar"/>
+        </w:rPr>
+        <w:t xml:space="preserve">Oportunidad</w:t>
+      </w:r>
+      <w:r>
+        <w:t xml:space="preserve">,</w:t>
+      </w:r>
+      <w:r>
+        <w:t xml:space="preserve"> </w:t>
+      </w:r>
+      <w:r>
+        <w:rPr>
+          <w:rStyle w:val="VerbatimChar"/>
+        </w:rPr>
+        <w:t xml:space="preserve">Cotización</w:t>
+      </w:r>
+      <w:r>
+        <w:t xml:space="preserve">,</w:t>
+      </w:r>
+      <w:r>
+        <w:t xml:space="preserve"> </w:t>
+      </w:r>
+      <w:r>
+        <w:rPr>
+          <w:rStyle w:val="VerbatimChar"/>
+        </w:rPr>
+        <w:t xml:space="preserve">Viaje</w:t>
+      </w:r>
+      <w:r>
+        <w:t xml:space="preserve">,</w:t>
+      </w:r>
+      <w:r>
+        <w:t xml:space="preserve"> </w:t>
+      </w:r>
+      <w:r>
+        <w:rPr>
+          <w:rStyle w:val="VerbatimChar"/>
+        </w:rPr>
+        <w:t xml:space="preserve">Pago</w:t>
+      </w:r>
+      <w:r>
+        <w:t xml:space="preserve">,</w:t>
+      </w:r>
+      <w:r>
+        <w:t xml:space="preserve"> </w:t>
+      </w:r>
+      <w:r>
+        <w:rPr>
+          <w:rStyle w:val="VerbatimChar"/>
+        </w:rPr>
+        <w:t xml:space="preserve">Alerta</w:t>
+      </w:r>
+      <w:r>
+        <w:t xml:space="preserve">…).</w:t>
       </w:r>
     </w:p>
     <w:p>
@@ -29159,7 +28634,7 @@
         </w:numPr>
       </w:pPr>
       <w:r>
-        <w:t xml:space="preserve">Revisa el estado del repositorio y trae la última versión del trabajo del equipo.</w:t>
+        <w:t xml:space="preserve">Respetar el alcance: no implementar pagos online, publicación automática en redes, integración con mayoristas ni facturación.</w:t>
       </w:r>
     </w:p>
     <w:p>
@@ -29171,7 +28646,7 @@
         </w:numPr>
       </w:pPr>
       <w:r>
-        <w:t xml:space="preserve">Lee el estado del proyecto, la bitácora de sesiones y la memoria del proyecto.</w:t>
+        <w:t xml:space="preserve">No aprobar ni formalizar nada sin la aprobación explícita del equipo, y no inventar datos del negocio: si falta información, avanzar con una propuesta marcada como borrador.</w:t>
       </w:r>
     </w:p>
     <w:p>
@@ -29183,7 +28658,7 @@
         </w:numPr>
       </w:pPr>
       <w:r>
-        <w:t xml:space="preserve">Comprueba que estén disponibles las skills compartidas del equipo.</w:t>
+        <w:t xml:space="preserve">Cuando dos documentos se contradicen, aplicar el orden de autoridad (el relevamiento, después las decisiones aprobadas y después el resto) y resolverlo con una decisión, no eligiendo una versión en silencio.</w:t>
       </w:r>
     </w:p>
     <w:p>
@@ -29195,7 +28670,7 @@
         </w:numPr>
       </w:pPr>
       <w:r>
-        <w:t xml:space="preserve">Abre solo las notas relacionadas con la tarea, entrando por su índice, y consulta las decisiones relacionadas antes de proponer un cambio.</w:t>
+        <w:t xml:space="preserve">Preservar los cambios de los demás, no guardar credenciales en Git y no cambiar la identidad de Git de nadie.</w:t>
       </w:r>
     </w:p>
     <w:p>
@@ -29207,7 +28682,241 @@
           <w:b/>
           <w:bCs/>
         </w:rPr>
-        <w:t xml:space="preserve">Reglas de trabajo durante la sesión:</w:t>
+        <w:t xml:space="preserve">Cómo cierra cada sesión:</w:t>
+      </w:r>
+      <w:r>
+        <w:t xml:space="preserve"> </w:t>
+      </w:r>
+      <w:r>
+        <w:t xml:space="preserve">verifica el resultado, actualiza la memoria del proyecto, registra una entrada en la bitácora (quién, qué se hizo y qué quedó pendiente), revisa los cambios, hace un commit con la identidad de la persona, integra el trabajo remoto y lo sube.</w:t>
+      </w:r>
+    </w:p>
+    <w:bookmarkEnd w:id="209"/>
+    <w:bookmarkStart w:id="210" w:name="el-prompt-de-cada-sesión"/>
+    <w:p>
+      <w:pPr>
+        <w:pStyle w:val="Heading3"/>
+      </w:pPr>
+      <w:r>
+        <w:t xml:space="preserve">2. El prompt de cada sesión</w:t>
+      </w:r>
+    </w:p>
+    <w:p>
+      <w:pPr>
+        <w:pStyle w:val="FirstParagraph"/>
+      </w:pPr>
+      <w:r>
+        <w:t xml:space="preserve">Gracias a</w:t>
+      </w:r>
+      <w:r>
+        <w:t xml:space="preserve"> </w:t>
+      </w:r>
+      <w:r>
+        <w:rPr>
+          <w:rStyle w:val="VerbatimChar"/>
+        </w:rPr>
+        <w:t xml:space="preserve">CLAUDE.md</w:t>
+      </w:r>
+      <w:r>
+        <w:t xml:space="preserve">, el pedido con el que arranca una sesión puede ser corto. En Claude Code alcanza con:</w:t>
+      </w:r>
+    </w:p>
+    <w:p>
+      <w:pPr>
+        <w:pStyle w:val="BlockText"/>
+      </w:pPr>
+      <w:r>
+        <w:t xml:space="preserve">Hola, entrá en contexto.</w:t>
+      </w:r>
+    </w:p>
+    <w:p>
+      <w:pPr>
+        <w:pStyle w:val="FirstParagraph"/>
+      </w:pPr>
+      <w:r>
+        <w:t xml:space="preserve">Con eso el agente aplica todo el protocolo de arriba: saluda a la persona, le avisa qué tiene pendiente y resume el estado del proyecto. Después, cada pedido describe la tarea, por ejemplo «revisemos y decime qué falta» o «armá el entregable con el mismo formato Word que los demás».</w:t>
+      </w:r>
+    </w:p>
+    <w:p>
+      <w:pPr>
+        <w:pStyle w:val="BodyText"/>
+      </w:pPr>
+      <w:r>
+        <w:t xml:space="preserve">Cuando el agente se usa fuera de Claude Code, sin</w:t>
+      </w:r>
+      <w:r>
+        <w:t xml:space="preserve"> </w:t>
+      </w:r>
+      <w:r>
+        <w:rPr>
+          <w:rStyle w:val="VerbatimChar"/>
+        </w:rPr>
+        <w:t xml:space="preserve">CLAUDE.md</w:t>
+      </w:r>
+      <w:r>
+        <w:t xml:space="preserve">, el equipo arranca con este prompt:</w:t>
+      </w:r>
+    </w:p>
+    <w:p>
+      <w:pPr>
+        <w:pStyle w:val="BlockText"/>
+      </w:pPr>
+      <w:r>
+        <w:t xml:space="preserve">Leé</w:t>
+      </w:r>
+      <w:r>
+        <w:t xml:space="preserve"> </w:t>
+      </w:r>
+      <w:r>
+        <w:rPr>
+          <w:rStyle w:val="VerbatimChar"/>
+        </w:rPr>
+        <w:t xml:space="preserve">00-Inicio/Estado del proyecto.md</w:t>
+      </w:r>
+      <w:r>
+        <w:t xml:space="preserve">,</w:t>
+      </w:r>
+      <w:r>
+        <w:t xml:space="preserve"> </w:t>
+      </w:r>
+      <w:r>
+        <w:rPr>
+          <w:rStyle w:val="VerbatimChar"/>
+        </w:rPr>
+        <w:t xml:space="preserve">06-Desarrollo/Claude Code — memoria del proyecto.md</w:t>
+      </w:r>
+      <w:r>
+        <w:t xml:space="preserve"> </w:t>
+      </w:r>
+      <w:r>
+        <w:t xml:space="preserve">y las notas vinculadas a esta tarea. Respetá las decisiones en revisión y no formalices nada sin indicación del equipo. Al terminar, actualizá la memoria correspondiente y prepará un commit claro.</w:t>
+      </w:r>
+    </w:p>
+    <w:bookmarkEnd w:id="210"/>
+    <w:bookmarkStart w:id="211" w:name="Xbbc72242f95de202c66008c65626084fac6cdd5"/>
+    <w:p>
+      <w:pPr>
+        <w:pStyle w:val="Heading3"/>
+      </w:pPr>
+      <w:r>
+        <w:t xml:space="preserve">3. Prompts reutilizables: las skills del proyecto</w:t>
+      </w:r>
+    </w:p>
+    <w:p>
+      <w:pPr>
+        <w:pStyle w:val="FirstParagraph"/>
+      </w:pPr>
+      <w:r>
+        <w:t xml:space="preserve">Un procedimiento que se repite se escribe una vez como</w:t>
+      </w:r>
+      <w:r>
+        <w:t xml:space="preserve"> </w:t>
+      </w:r>
+      <w:r>
+        <w:rPr>
+          <w:b/>
+          <w:bCs/>
+        </w:rPr>
+        <w:t xml:space="preserve">skill</w:t>
+      </w:r>
+      <w:r>
+        <w:t xml:space="preserve">: un prompt con nombre, versionado en</w:t>
+      </w:r>
+      <w:r>
+        <w:t xml:space="preserve"> </w:t>
+      </w:r>
+      <w:r>
+        <w:rPr>
+          <w:rStyle w:val="VerbatimChar"/>
+        </w:rPr>
+        <w:t xml:space="preserve">.claude/skills/</w:t>
+      </w:r>
+      <w:r>
+        <w:t xml:space="preserve">, que el agente aplica cuando la tarea lo pide. Por ejemplo, la skill</w:t>
+      </w:r>
+      <w:r>
+        <w:t xml:space="preserve"> </w:t>
+      </w:r>
+      <w:r>
+        <w:rPr>
+          <w:rStyle w:val="VerbatimChar"/>
+        </w:rPr>
+        <w:t xml:space="preserve">gestionar-skills</w:t>
+      </w:r>
+      <w:r>
+        <w:t xml:space="preserve"> </w:t>
+      </w:r>
+      <w:r>
+        <w:t xml:space="preserve">indica cómo incorporar una skill nueva al proyecto:</w:t>
+      </w:r>
+    </w:p>
+    <w:p>
+      <w:pPr>
+        <w:pStyle w:val="BlockText"/>
+      </w:pPr>
+      <w:r>
+        <w:t xml:space="preserve">Gestiona, instala, crea, actualiza y comparte skills de Claude Code para Rumbo. Usar cuando alguien pida agregar, instalar, eliminar, revisar o distribuir una skill o un plugin con skills.</w:t>
+      </w:r>
+    </w:p>
+    <w:p>
+      <w:pPr>
+        <w:pStyle w:val="BlockText"/>
+      </w:pPr>
+      <w:r>
+        <w:t xml:space="preserve">Antes de actuar: leer el catálogo de skills compartidas, revisar las skills disponibles para evitar duplicados, identificar el origen, la versión, la licencia y los permisos, y decidir si corresponde una skill de proyecto o una dependencia externa.</w:t>
+      </w:r>
+    </w:p>
+    <w:p>
+      <w:pPr>
+        <w:pStyle w:val="FirstParagraph"/>
+      </w:pPr>
+      <w:r>
+        <w:t xml:space="preserve">Así, cualquier integrante obtiene el mismo resultado con el mismo pedido, porque el procedimiento vive en el repositorio y no en la memoria de una persona.</w:t>
+      </w:r>
+    </w:p>
+    <w:bookmarkEnd w:id="211"/>
+    <w:bookmarkEnd w:id="212"/>
+    <w:bookmarkEnd w:id="213"/>
+    <w:bookmarkStart w:id="220" w:name="modelado-con-mermaid.js"/>
+    <w:p>
+      <w:pPr>
+        <w:pStyle w:val="Heading1"/>
+      </w:pPr>
+      <w:r>
+        <w:t xml:space="preserve">8. Modelado con Mermaid.js</w:t>
+      </w:r>
+    </w:p>
+    <w:p>
+      <w:pPr>
+        <w:pStyle w:val="FirstParagraph"/>
+      </w:pPr>
+      <w:r>
+        <w:t xml:space="preserve">Todos los diagramas de Rumbo se escriben como</w:t>
+      </w:r>
+      <w:r>
+        <w:t xml:space="preserve"> </w:t>
+      </w:r>
+      <w:r>
+        <w:rPr>
+          <w:b/>
+          <w:bCs/>
+        </w:rPr>
+        <w:t xml:space="preserve">código Mermaid.js</w:t>
+      </w:r>
+      <w:r>
+        <w:t xml:space="preserve"> </w:t>
+      </w:r>
+      <w:r>
+        <w:t xml:space="preserve">dentro de la nota que los explica, y se exportan a imagen solo para los documentos y la presentación.</w:t>
+      </w:r>
+    </w:p>
+    <w:bookmarkStart w:id="214" w:name="por-qué-mermaid"/>
+    <w:p>
+      <w:pPr>
+        <w:pStyle w:val="Heading2"/>
+      </w:pPr>
+      <w:r>
+        <w:t xml:space="preserve">Por qué Mermaid</w:t>
       </w:r>
     </w:p>
     <w:p>
@@ -29219,88 +28928,17 @@
         </w:numPr>
       </w:pPr>
       <w:r>
-        <w:t xml:space="preserve">Escribir en español de Argentina, con importes en ARS y fechas</w:t>
-      </w:r>
-      <w:r>
-        <w:t xml:space="preserve"> </w:t>
-      </w:r>
-      <w:r>
-        <w:rPr>
-          <w:rStyle w:val="VerbatimChar"/>
-        </w:rPr>
-        <w:t xml:space="preserve">dd/mm/aa</w:t>
-      </w:r>
-      <w:r>
-        <w:t xml:space="preserve">, y respetar los nombres del lenguaje del negocio (</w:t>
-      </w:r>
-      <w:r>
-        <w:rPr>
-          <w:rStyle w:val="VerbatimChar"/>
-        </w:rPr>
-        <w:t xml:space="preserve">Cliente</w:t>
-      </w:r>
-      <w:r>
-        <w:t xml:space="preserve">,</w:t>
-      </w:r>
-      <w:r>
-        <w:t xml:space="preserve"> </w:t>
-      </w:r>
-      <w:r>
-        <w:rPr>
-          <w:rStyle w:val="VerbatimChar"/>
-        </w:rPr>
-        <w:t xml:space="preserve">Oportunidad</w:t>
-      </w:r>
-      <w:r>
-        <w:t xml:space="preserve">,</w:t>
-      </w:r>
-      <w:r>
-        <w:t xml:space="preserve"> </w:t>
-      </w:r>
-      <w:r>
-        <w:rPr>
-          <w:rStyle w:val="VerbatimChar"/>
-        </w:rPr>
-        <w:t xml:space="preserve">Cotización</w:t>
-      </w:r>
-      <w:r>
-        <w:t xml:space="preserve">,</w:t>
-      </w:r>
-      <w:r>
-        <w:t xml:space="preserve"> </w:t>
-      </w:r>
-      <w:r>
-        <w:rPr>
-          <w:rStyle w:val="VerbatimChar"/>
-        </w:rPr>
-        <w:t xml:space="preserve">Viaje</w:t>
-      </w:r>
-      <w:r>
-        <w:t xml:space="preserve">,</w:t>
-      </w:r>
-      <w:r>
-        <w:t xml:space="preserve"> </w:t>
-      </w:r>
-      <w:r>
-        <w:rPr>
-          <w:rStyle w:val="VerbatimChar"/>
-        </w:rPr>
-        <w:t xml:space="preserve">Pago</w:t>
-      </w:r>
-      <w:r>
-        <w:t xml:space="preserve">,</w:t>
-      </w:r>
-      <w:r>
-        <w:t xml:space="preserve"> </w:t>
-      </w:r>
-      <w:r>
-        <w:rPr>
-          <w:rStyle w:val="VerbatimChar"/>
-        </w:rPr>
-        <w:t xml:space="preserve">Alerta</w:t>
-      </w:r>
-      <w:r>
-        <w:t xml:space="preserve">…).</w:t>
+        <w:rPr>
+          <w:b/>
+          <w:bCs/>
+        </w:rPr>
+        <w:t xml:space="preserve">Diagramas como código:</w:t>
+      </w:r>
+      <w:r>
+        <w:t xml:space="preserve"> </w:t>
+      </w:r>
+      <w:r>
+        <w:t xml:space="preserve">el diagrama es texto, se versiona en Git junto con el resto del proyecto y cada cambio queda registrado con su autor. Dos personas no pisan el mismo diagrama sin que se note.</w:t>
       </w:r>
     </w:p>
     <w:p>
@@ -29312,7 +28950,17 @@
         </w:numPr>
       </w:pPr>
       <w:r>
-        <w:t xml:space="preserve">Respetar el alcance: no implementar pagos online, publicación automática en redes, integración con mayoristas ni facturación.</w:t>
+        <w:rPr>
+          <w:b/>
+          <w:bCs/>
+        </w:rPr>
+        <w:t xml:space="preserve">Una sola fuente:</w:t>
+      </w:r>
+      <w:r>
+        <w:t xml:space="preserve"> </w:t>
+      </w:r>
+      <w:r>
+        <w:t xml:space="preserve">la imagen se genera desde el código; nunca se edita a mano. Si cambia el modelo, se cambia el código y se vuelve a exportar.</w:t>
       </w:r>
     </w:p>
     <w:p>
@@ -29324,7 +28972,17 @@
         </w:numPr>
       </w:pPr>
       <w:r>
-        <w:t xml:space="preserve">No aprobar ni formalizar nada sin la aprobación explícita del equipo, y no inventar datos del negocio: si falta información, avanzar con una propuesta marcada como borrador.</w:t>
+        <w:rPr>
+          <w:b/>
+          <w:bCs/>
+        </w:rPr>
+        <w:t xml:space="preserve">Cobertura UML:</w:t>
+      </w:r>
+      <w:r>
+        <w:t xml:space="preserve"> </w:t>
+      </w:r>
+      <w:r>
+        <w:t xml:space="preserve">Mermaid dibuja de forma nativa diagramas de clases, de secuencia, de estados y entidad-relación. Los de casos de uso, actividad y C4 se representan con diagramas de flujo, con la notación de cada uno.</w:t>
       </w:r>
     </w:p>
     <w:p>
@@ -29336,134 +28994,27 @@
         </w:numPr>
       </w:pPr>
       <w:r>
-        <w:t xml:space="preserve">Cuando dos documentos se contradicen, aplicar el orden de autoridad (el relevamiento, después las decisiones aprobadas y después el resto) y resolverlo con una decisión, no eligiendo una versión en silencio.</w:t>
-      </w:r>
-    </w:p>
-    <w:p>
-      <w:pPr>
-        <w:pStyle w:val="Compact"/>
-        <w:numPr>
-          <w:ilvl w:val="0"/>
-          <w:numId w:val="1032"/>
-        </w:numPr>
-      </w:pPr>
-      <w:r>
-        <w:t xml:space="preserve">Preservar los cambios de los demás, no guardar credenciales en Git y no cambiar la identidad de Git de nadie.</w:t>
-      </w:r>
-    </w:p>
-    <w:p>
-      <w:pPr>
-        <w:pStyle w:val="FirstParagraph"/>
-      </w:pPr>
-      <w:r>
         <w:rPr>
           <w:b/>
           <w:bCs/>
         </w:rPr>
-        <w:t xml:space="preserve">Cómo cierra cada sesión:</w:t>
-      </w:r>
-      <w:r>
-        <w:t xml:space="preserve"> </w:t>
-      </w:r>
-      <w:r>
-        <w:t xml:space="preserve">verifica el resultado, actualiza la memoria del proyecto, registra una entrada en la bitácora (quién, qué se hizo y qué quedó pendiente), revisa los cambios, hace un commit con la identidad de la persona, integra el trabajo remoto y lo sube.</w:t>
-      </w:r>
-    </w:p>
-    <w:p>
-      <w:pPr>
-        <w:pStyle w:val="BodyText"/>
-      </w:pPr>
-      <w:r>
-        <w:rPr>
-          <w:b/>
-          <w:bCs/>
-        </w:rPr>
-        <w:t xml:space="preserve">Prompt inicial de ejemplo.</w:t>
-      </w:r>
-      <w:r>
-        <w:t xml:space="preserve"> </w:t>
-      </w:r>
-      <w:r>
-        <w:t xml:space="preserve">Cuando el agente se usa fuera de Claude Code, el equipo arranca la conversación con este pedido:</w:t>
-      </w:r>
-    </w:p>
-    <w:p>
-      <w:pPr>
-        <w:pStyle w:val="BlockText"/>
-      </w:pPr>
-      <w:r>
-        <w:t xml:space="preserve">Leé</w:t>
-      </w:r>
-      <w:r>
-        <w:t xml:space="preserve"> </w:t>
-      </w:r>
-      <w:r>
-        <w:rPr>
-          <w:rStyle w:val="VerbatimChar"/>
-        </w:rPr>
-        <w:t xml:space="preserve">00-Inicio/Estado del proyecto.md</w:t>
-      </w:r>
-      <w:r>
-        <w:t xml:space="preserve">,</w:t>
-      </w:r>
-      <w:r>
-        <w:t xml:space="preserve"> </w:t>
-      </w:r>
-      <w:r>
-        <w:rPr>
-          <w:rStyle w:val="VerbatimChar"/>
-        </w:rPr>
-        <w:t xml:space="preserve">06-Desarrollo/Claude Code — memoria del proyecto.md</w:t>
-      </w:r>
-      <w:r>
-        <w:t xml:space="preserve"> </w:t>
-      </w:r>
-      <w:r>
-        <w:t xml:space="preserve">y las notas vinculadas a esta tarea. Respetá las decisiones en revisión y no formalices nada sin indicación del equipo. Al terminar, actualizá la memoria correspondiente y prepará un commit claro.</w:t>
-      </w:r>
-    </w:p>
-    <w:bookmarkEnd w:id="215"/>
-    <w:bookmarkEnd w:id="216"/>
-    <w:bookmarkStart w:id="223" w:name="modelado-con-mermaid.js"/>
-    <w:p>
-      <w:pPr>
-        <w:pStyle w:val="Heading1"/>
-      </w:pPr>
-      <w:r>
-        <w:t xml:space="preserve">8. Modelado con Mermaid.js</w:t>
-      </w:r>
-    </w:p>
-    <w:p>
-      <w:pPr>
-        <w:pStyle w:val="FirstParagraph"/>
-      </w:pPr>
-      <w:r>
-        <w:t xml:space="preserve">Todos los diagramas de Rumbo se escriben como</w:t>
-      </w:r>
-      <w:r>
-        <w:t xml:space="preserve"> </w:t>
-      </w:r>
-      <w:r>
-        <w:rPr>
-          <w:b/>
-          <w:bCs/>
-        </w:rPr>
-        <w:t xml:space="preserve">código Mermaid.js</w:t>
-      </w:r>
-      <w:r>
-        <w:t xml:space="preserve"> </w:t>
-      </w:r>
-      <w:r>
-        <w:t xml:space="preserve">dentro de la nota que los explica, y se exportan a imagen solo para los documentos y la presentación.</w:t>
-      </w:r>
-    </w:p>
-    <w:bookmarkStart w:id="217" w:name="por-qué-mermaid"/>
+        <w:t xml:space="preserve">Gratis y portable:</w:t>
+      </w:r>
+      <w:r>
+        <w:t xml:space="preserve"> </w:t>
+      </w:r>
+      <w:r>
+        <w:t xml:space="preserve">no requiere cuenta ni licencia, y lo integran el editor del equipo (Obsidian) y GitHub.</w:t>
+      </w:r>
+    </w:p>
+    <w:bookmarkEnd w:id="214"/>
+    <w:bookmarkStart w:id="215" w:name="cómo-se-trabaja"/>
     <w:p>
       <w:pPr>
         <w:pStyle w:val="Heading2"/>
       </w:pPr>
       <w:r>
-        <w:t xml:space="preserve">Por qué Mermaid</w:t>
+        <w:t xml:space="preserve">Cómo se trabaja</w:t>
       </w:r>
     </w:p>
     <w:p>
@@ -29475,17 +29026,20 @@
         </w:numPr>
       </w:pPr>
       <w:r>
+        <w:t xml:space="preserve">Se usa el motor de diseño</w:t>
+      </w:r>
+      <w:r>
+        <w:t xml:space="preserve"> </w:t>
+      </w:r>
+      <w:r>
         <w:rPr>
           <w:b/>
           <w:bCs/>
         </w:rPr>
-        <w:t xml:space="preserve">Diagramas como código:</w:t>
-      </w:r>
-      <w:r>
-        <w:t xml:space="preserve"> </w:t>
-      </w:r>
-      <w:r>
-        <w:t xml:space="preserve">el diagrama es texto, se versiona en Git junto con el resto del proyecto y cada cambio queda registrado con su autor. Dos personas no pisan el mismo diagrama sin que se note.</w:t>
+        <w:t xml:space="preserve">ELK</w:t>
+      </w:r>
+      <w:r>
+        <w:t xml:space="preserve">, que dibuja líneas rectas y ortogonales y ordena mejor los diagramas grandes.</w:t>
       </w:r>
     </w:p>
     <w:p>
@@ -29497,17 +29051,31 @@
         </w:numPr>
       </w:pPr>
       <w:r>
-        <w:rPr>
-          <w:b/>
-          <w:bCs/>
-        </w:rPr>
-        <w:t xml:space="preserve">Una sola fuente:</w:t>
-      </w:r>
-      <w:r>
-        <w:t xml:space="preserve"> </w:t>
-      </w:r>
-      <w:r>
-        <w:t xml:space="preserve">la imagen se genera desde el código; nunca se edita a mano. Si cambia el modelo, se cambia el código y se vuelve a exportar.</w:t>
+        <w:t xml:space="preserve">Cada tipo de diagrama tiene un script que exporta sus imágenes con</w:t>
+      </w:r>
+      <w:r>
+        <w:t xml:space="preserve"> </w:t>
+      </w:r>
+      <w:r>
+        <w:rPr>
+          <w:rStyle w:val="VerbatimChar"/>
+        </w:rPr>
+        <w:t xml:space="preserve">mermaid-cli</w:t>
+      </w:r>
+      <w:r>
+        <w:t xml:space="preserve"> </w:t>
+      </w:r>
+      <w:r>
+        <w:t xml:space="preserve">(</w:t>
+      </w:r>
+      <w:r>
+        <w:rPr>
+          <w:rStyle w:val="VerbatimChar"/>
+        </w:rPr>
+        <w:t xml:space="preserve">npx @mermaid-js/mermaid-cli</w:t>
+      </w:r>
+      <w:r>
+        <w:t xml:space="preserve">), en alta resolución para que se lean impresas.</w:t>
       </w:r>
     </w:p>
     <w:p>
@@ -29516,121 +29084,6 @@
         <w:numPr>
           <w:ilvl w:val="0"/>
           <w:numId w:val="1033"/>
-        </w:numPr>
-      </w:pPr>
-      <w:r>
-        <w:rPr>
-          <w:b/>
-          <w:bCs/>
-        </w:rPr>
-        <w:t xml:space="preserve">Cobertura UML:</w:t>
-      </w:r>
-      <w:r>
-        <w:t xml:space="preserve"> </w:t>
-      </w:r>
-      <w:r>
-        <w:t xml:space="preserve">Mermaid dibuja de forma nativa diagramas de clases, de secuencia, de estados y entidad-relación. Los de casos de uso, actividad y C4 se representan con diagramas de flujo, con la notación de cada uno.</w:t>
-      </w:r>
-    </w:p>
-    <w:p>
-      <w:pPr>
-        <w:pStyle w:val="Compact"/>
-        <w:numPr>
-          <w:ilvl w:val="0"/>
-          <w:numId w:val="1033"/>
-        </w:numPr>
-      </w:pPr>
-      <w:r>
-        <w:rPr>
-          <w:b/>
-          <w:bCs/>
-        </w:rPr>
-        <w:t xml:space="preserve">Gratis y portable:</w:t>
-      </w:r>
-      <w:r>
-        <w:t xml:space="preserve"> </w:t>
-      </w:r>
-      <w:r>
-        <w:t xml:space="preserve">no requiere cuenta ni licencia, y lo integran el editor del equipo (Obsidian) y GitHub.</w:t>
-      </w:r>
-    </w:p>
-    <w:bookmarkEnd w:id="217"/>
-    <w:bookmarkStart w:id="218" w:name="cómo-se-trabaja"/>
-    <w:p>
-      <w:pPr>
-        <w:pStyle w:val="Heading2"/>
-      </w:pPr>
-      <w:r>
-        <w:t xml:space="preserve">Cómo se trabaja</w:t>
-      </w:r>
-    </w:p>
-    <w:p>
-      <w:pPr>
-        <w:pStyle w:val="Compact"/>
-        <w:numPr>
-          <w:ilvl w:val="0"/>
-          <w:numId w:val="1034"/>
-        </w:numPr>
-      </w:pPr>
-      <w:r>
-        <w:t xml:space="preserve">Se usa el motor de diseño</w:t>
-      </w:r>
-      <w:r>
-        <w:t xml:space="preserve"> </w:t>
-      </w:r>
-      <w:r>
-        <w:rPr>
-          <w:b/>
-          <w:bCs/>
-        </w:rPr>
-        <w:t xml:space="preserve">ELK</w:t>
-      </w:r>
-      <w:r>
-        <w:t xml:space="preserve">, que dibuja líneas rectas y ortogonales y ordena mejor los diagramas grandes.</w:t>
-      </w:r>
-    </w:p>
-    <w:p>
-      <w:pPr>
-        <w:pStyle w:val="Compact"/>
-        <w:numPr>
-          <w:ilvl w:val="0"/>
-          <w:numId w:val="1034"/>
-        </w:numPr>
-      </w:pPr>
-      <w:r>
-        <w:t xml:space="preserve">Cada tipo de diagrama tiene un script que exporta sus imágenes con</w:t>
-      </w:r>
-      <w:r>
-        <w:t xml:space="preserve"> </w:t>
-      </w:r>
-      <w:r>
-        <w:rPr>
-          <w:rStyle w:val="VerbatimChar"/>
-        </w:rPr>
-        <w:t xml:space="preserve">mermaid-cli</w:t>
-      </w:r>
-      <w:r>
-        <w:t xml:space="preserve"> </w:t>
-      </w:r>
-      <w:r>
-        <w:t xml:space="preserve">(</w:t>
-      </w:r>
-      <w:r>
-        <w:rPr>
-          <w:rStyle w:val="VerbatimChar"/>
-        </w:rPr>
-        <w:t xml:space="preserve">npx @mermaid-js/mermaid-cli</w:t>
-      </w:r>
-      <w:r>
-        <w:t xml:space="preserve">), en alta resolución para que se lean impresas.</w:t>
-      </w:r>
-    </w:p>
-    <w:p>
-      <w:pPr>
-        <w:pStyle w:val="Compact"/>
-        <w:numPr>
-          <w:ilvl w:val="0"/>
-          <w:numId w:val="1034"/>
         </w:numPr>
       </w:pPr>
       <w:r>
@@ -29915,8 +29368,8 @@
         </w:tc>
       </w:tr>
     </w:tbl>
-    <w:bookmarkEnd w:id="218"/>
-    <w:bookmarkStart w:id="222" w:name="ejemplo-1"/>
+    <w:bookmarkEnd w:id="215"/>
+    <w:bookmarkStart w:id="219" w:name="ejemplo"/>
     <w:p>
       <w:pPr>
         <w:pStyle w:val="Heading2"/>
@@ -29998,18 +29451,18 @@
           <wp:inline>
             <wp:extent cx="5753100" cy="594389"/>
             <wp:effectExtent b="0" l="0" r="0" t="0"/>
-            <wp:docPr descr="Imagen generada desde el código de arriba." title="" id="220" name="Picture"/>
+            <wp:docPr descr="Imagen generada desde el código de arriba." title="" id="217" name="Picture"/>
             <a:graphic>
               <a:graphicData uri="http://schemas.openxmlformats.org/drawingml/2006/picture">
                 <pic:pic>
                   <pic:nvPicPr>
-                    <pic:cNvPr descr="DES-pipeline-calidad.png" id="221" name="Picture"/>
+                    <pic:cNvPr descr="DES-pipeline-calidad.png" id="218" name="Picture"/>
                     <pic:cNvPicPr>
                       <a:picLocks noChangeArrowheads="1" noChangeAspect="1"/>
                     </pic:cNvPicPr>
                   </pic:nvPicPr>
                   <pic:blipFill>
-                    <a:blip r:embed="rId219"/>
+                    <a:blip r:embed="rId216"/>
                     <a:stretch>
                       <a:fillRect/>
                     </a:stretch>
@@ -30044,9 +29497,9 @@
         <w:t xml:space="preserve">Imagen generada desde el código de arriba.</w:t>
       </w:r>
     </w:p>
-    <w:bookmarkEnd w:id="222"/>
-    <w:bookmarkEnd w:id="223"/>
-    <w:bookmarkStart w:id="224" w:name="X22ac271ac10ccb082b4a2722bfce6c34065f14e"/>
+    <w:bookmarkEnd w:id="219"/>
+    <w:bookmarkEnd w:id="220"/>
+    <w:bookmarkStart w:id="221" w:name="X22ac271ac10ccb082b4a2722bfce6c34065f14e"/>
     <w:p>
       <w:pPr>
         <w:pStyle w:val="Heading1"/>
@@ -30344,19 +29797,37 @@
               <w:pStyle w:val="Compact"/>
             </w:pPr>
             <w:r>
+              <w:t xml:space="preserve">Los prompts con los que se construyó el producto:</w:t>
+            </w:r>
+            <w:r>
+              <w:t xml:space="preserve"> </w:t>
+            </w:r>
+            <w:r>
               <w:rPr>
                 <w:rStyle w:val="VerbatimChar"/>
               </w:rPr>
               <w:t xml:space="preserve">CLAUDE.md</w:t>
             </w:r>
             <w:r>
-              <w:t xml:space="preserve">, las instrucciones del agente de desarrollo.</w:t>
+              <w:t xml:space="preserve">, el prompt de sistema del agente de desarrollo, y la skill del proyecto</w:t>
+            </w:r>
+            <w:r>
+              <w:t xml:space="preserve"> </w:t>
+            </w:r>
+            <w:r>
+              <w:rPr>
+                <w:rStyle w:val="VerbatimChar"/>
+              </w:rPr>
+              <w:t xml:space="preserve">gestionar-skills</w:t>
+            </w:r>
+            <w:r>
+              <w:t xml:space="preserve">.</w:t>
             </w:r>
           </w:p>
         </w:tc>
       </w:tr>
     </w:tbl>
-    <w:bookmarkEnd w:id="224"/>
+    <w:bookmarkEnd w:id="221"/>
     <w:sectPr>
       <w:footerReference r:id="rId40" w:type="default"/>
       <w:footnotePr>
@@ -30858,9 +30329,6 @@
     <w:abstractNumId w:val="991"/>
   </w:num>
   <w:num w:numId="1030">
-    <w:abstractNumId w:val="991"/>
-  </w:num>
-  <w:num w:numId="1031">
     <w:abstractNumId w:val="99411"/>
     <w:lvlOverride w:ilvl="0">
       <w:startOverride w:val="1"/>
@@ -30890,13 +30358,13 @@
       <w:startOverride w:val="1"/>
     </w:lvlOverride>
   </w:num>
+  <w:num w:numId="1031">
+    <w:abstractNumId w:val="991"/>
+  </w:num>
   <w:num w:numId="1032">
     <w:abstractNumId w:val="991"/>
   </w:num>
   <w:num w:numId="1033">
-    <w:abstractNumId w:val="991"/>
-  </w:num>
-  <w:num w:numId="1034">
     <w:abstractNumId w:val="991"/>
   </w:num>
 </w:numbering>

</xml_diff>

<commit_message>
G2 y G3: ARQ — MVC y modelo conceptual por capa revisada y formalizada
Aprobada por Nahuel el 30/09. Ajustes: módulo seguridad y mobile con clientes
en G3; en ARQ, configuración y moderación son de admin y dueño.

Co-Authored-By: Claude Sonnet 5.5 <noreply@anthropic.com>
</commit_message>
<xml_diff>
--- a/07-Entregables/PC1/Rumbo — PC1.docx
+++ b/07-Entregables/PC1/Rumbo — PC1.docx
@@ -4360,7 +4360,7 @@
         <w:t xml:space="preserve"> </w:t>
       </w:r>
       <w:r>
-        <w:t xml:space="preserve">los once módulos (clientes, oportunidades y cotizaciones, viajes, economía y pagos, alertas, configuración, hoteles, redes, dashboard, calendario y usuarios), mostrando a cada rol solo lo que le corresponde: el</w:t>
+        <w:t xml:space="preserve">los once módulos (clientes, oportunidades y cotizaciones, viajes, economía y pagos, alertas, configuración, hoteles, redes, dashboard, calendario y seguridad), mostrando a cada rol solo lo que le corresponde: el</w:t>
       </w:r>
       <w:r>
         <w:t xml:space="preserve"> </w:t>
@@ -4394,7 +4394,7 @@
         <w:t xml:space="preserve"> </w:t>
       </w:r>
       <w:r>
-        <w:t xml:space="preserve">la agenda y las alertas del día y la consulta de clientes, para el uso fuera de la oficina.</w:t>
+        <w:t xml:space="preserve">la agenda, las alertas del día y los clientes, para el uso fuera de la oficina.</w:t>
       </w:r>
     </w:p>
     <w:p>

</xml_diff>

<commit_message>
PC1: diagramas que no entraban en la página del documento principal
El diagrama de casos de uso y el ciclo de trabajo con el agente van con
alto máximo, y la actividad de CU-01 (27" de alto) se reemplaza en la
sección 4 por la del proceso automático diario. Documento regenerado.

Co-Authored-By: Claude Opus 5.5 <noreply@anthropic.com>
</commit_message>
<xml_diff>
--- a/07-Entregables/PC1/Rumbo — PC1.docx
+++ b/07-Entregables/PC1/Rumbo — PC1.docx
@@ -5905,7 +5905,7 @@
       <w:r>
         <w:drawing>
           <wp:inline>
-            <wp:extent cx="3164205" cy="10259450"/>
+            <wp:extent cx="2397152" cy="7772400"/>
             <wp:effectExtent b="0" l="0" r="0" t="0"/>
             <wp:docPr descr="Diagrama de casos de uso." title="" id="121" name="Picture"/>
             <a:graphic>
@@ -5926,7 +5926,7 @@
                   <pic:spPr bwMode="auto">
                     <a:xfrm>
                       <a:off x="0" y="0"/>
-                      <a:ext cx="3164205" cy="10259450"/>
+                      <a:ext cx="2397152" cy="7772400"/>
                     </a:xfrm>
                     <a:prstGeom prst="rect">
                       <a:avLst/>
@@ -6400,7 +6400,7 @@
         <w:pStyle w:val="FirstParagraph"/>
       </w:pPr>
       <w:r>
-        <w:t xml:space="preserve">El circuito completo de CU-01, con las decisiones de cada paso y el actor que realiza cada acción.</w:t>
+        <w:t xml:space="preserve">El proceso automático diario: lo que el sistema hace solo, todos los días a las 00:00, sin que nadie lo dispare. Las cuatro tareas son independientes y corren en paralelo: vencer pagos, vencer cotizaciones, sugerir el avance de los viajes según sus fechas y detectar clientes para recontactar. Los diagramas de actividad de los casos de uso (CU-01, CU-07, CU-12 y CU-27) están en la carpeta de entrega.</w:t>
       </w:r>
     </w:p>
     <w:p>
@@ -6410,14 +6410,14 @@
       <w:r>
         <w:drawing>
           <wp:inline>
-            <wp:extent cx="4602480" cy="25114042"/>
+            <wp:extent cx="5753100" cy="3412234"/>
             <wp:effectExtent b="0" l="0" r="0" t="0"/>
-            <wp:docPr descr="Actividad: de la consulta a la venta." title="" id="143" name="Picture"/>
+            <wp:docPr descr="Actividad: proceso automático diario." title="" id="143" name="Picture"/>
             <a:graphic>
               <a:graphicData uri="http://schemas.openxmlformats.org/drawingml/2006/picture">
                 <pic:pic>
                   <pic:nvPicPr>
-                    <pic:cNvPr descr="DGM-ACT-consulta-a-venta.png" id="144" name="Picture"/>
+                    <pic:cNvPr descr="DGM-ACT-proceso-diario.png" id="144" name="Picture"/>
                     <pic:cNvPicPr>
                       <a:picLocks noChangeArrowheads="1" noChangeAspect="1"/>
                     </pic:cNvPicPr>
@@ -6431,7 +6431,7 @@
                   <pic:spPr bwMode="auto">
                     <a:xfrm>
                       <a:off x="0" y="0"/>
-                      <a:ext cx="4602480" cy="25114042"/>
+                      <a:ext cx="5753100" cy="3412234"/>
                     </a:xfrm>
                     <a:prstGeom prst="rect">
                       <a:avLst/>
@@ -6455,7 +6455,7 @@
         <w:pStyle w:val="ImageCaption"/>
       </w:pPr>
       <w:r>
-        <w:t xml:space="preserve">Actividad: de la consulta a la venta.</w:t>
+        <w:t xml:space="preserve">Actividad: proceso automático diario.</w:t>
       </w:r>
     </w:p>
     <w:bookmarkEnd w:id="145"/>
@@ -27470,7 +27470,7 @@
       <w:r>
         <w:drawing>
           <wp:inline>
-            <wp:extent cx="3164205" cy="10223655"/>
+            <wp:extent cx="2405545" cy="7772400"/>
             <wp:effectExtent b="0" l="0" r="0" t="0"/>
             <wp:docPr descr="Ciclo de trabajo de una sesión con el agente." title="" id="201" name="Picture"/>
             <a:graphic>
@@ -27491,7 +27491,7 @@
                   <pic:spPr bwMode="auto">
                     <a:xfrm>
                       <a:off x="0" y="0"/>
-                      <a:ext cx="3164205" cy="10223655"/>
+                      <a:ext cx="2405545" cy="7772400"/>
                     </a:xfrm>
                     <a:prstGeom prst="rect">
                       <a:avLst/>

</xml_diff>